<commit_message>
Update paths according to new directory structure in rhadcp guidelines
</commit_message>
<xml_diff>
--- a/Documents/Processing_documents/Signature_55Hz_processing_guide.docx
+++ b/Documents/Processing_documents/Signature_55Hz_processing_guide.docx
@@ -1,6 +1,6 @@
 
 <file path=word/document.xml><?xml version="1.0" encoding="utf-8"?>
-<w:document xmlns:wpc="http://schemas.microsoft.com/office/word/2010/wordprocessingCanvas" xmlns:cx="http://schemas.microsoft.com/office/drawing/2014/chartex" xmlns:cx1="http://schemas.microsoft.com/office/drawing/2015/9/8/chartex" xmlns:cx2="http://schemas.microsoft.com/office/drawing/2015/10/21/chartex" xmlns:cx3="http://schemas.microsoft.com/office/drawing/2016/5/9/chartex" xmlns:cx4="http://schemas.microsoft.com/office/drawing/2016/5/10/chartex" xmlns:cx5="http://schemas.microsoft.com/office/drawing/2016/5/11/chartex" xmlns:cx6="http://schemas.microsoft.com/office/drawing/2016/5/12/chartex" xmlns:cx7="http://schemas.microsoft.com/office/drawing/2016/5/13/chartex" xmlns:cx8="http://schemas.microsoft.com/office/drawing/2016/5/14/chartex" xmlns:mc="http://schemas.openxmlformats.org/markup-compatibility/2006" xmlns:aink="http://schemas.microsoft.com/office/drawing/2016/ink" xmlns:am3d="http://schemas.microsoft.com/office/drawing/2017/model3d" xmlns:o="urn:schemas-microsoft-com:office:office" xmlns:oel="http://schemas.microsoft.com/office/2019/extlst" xmlns:r="http://schemas.openxmlformats.org/officeDocument/2006/relationships" xmlns:m="http://schemas.openxmlformats.org/officeDocument/2006/math" xmlns:v="urn:schemas-microsoft-com:vml" xmlns:wp14="http://schemas.microsoft.com/office/word/2010/wordprocessingDrawing" xmlns:wp="http://schemas.openxmlformats.org/drawingml/2006/wordprocessingDrawing" xmlns:w10="urn:schemas-microsoft-com:office:word" xmlns:w="http://schemas.openxmlformats.org/wordprocessingml/2006/main" xmlns:w14="http://schemas.microsoft.com/office/word/2010/wordml" xmlns:w15="http://schemas.microsoft.com/office/word/2012/wordml" xmlns:w16cex="http://schemas.microsoft.com/office/word/2018/wordml/cex" xmlns:w16cid="http://schemas.microsoft.com/office/word/2016/wordml/cid" xmlns:w16="http://schemas.microsoft.com/office/word/2018/wordml" xmlns:w16du="http://schemas.microsoft.com/office/word/2023/wordml/word16du" xmlns:w16sdtdh="http://schemas.microsoft.com/office/word/2020/wordml/sdtdatahash" xmlns:w16sdtfl="http://schemas.microsoft.com/office/word/2024/wordml/sdtformatlock" xmlns:w16se="http://schemas.microsoft.com/office/word/2015/wordml/symex" xmlns:wpg="http://schemas.microsoft.com/office/word/2010/wordprocessingGroup" xmlns:wpi="http://schemas.microsoft.com/office/word/2010/wordprocessingInk" xmlns:wne="http://schemas.microsoft.com/office/word/2006/wordml" xmlns:wps="http://schemas.microsoft.com/office/word/2010/wordprocessingShape" mc:Ignorable="w14 w15 w16se w16cid w16 w16cex w16sdtdh w16sdtfl w16du wp14">
+<w:document xmlns:wpc="http://schemas.microsoft.com/office/word/2010/wordprocessingCanvas" xmlns:cx="http://schemas.microsoft.com/office/drawing/2014/chartex" xmlns:cx1="http://schemas.microsoft.com/office/drawing/2015/9/8/chartex" xmlns:cx2="http://schemas.microsoft.com/office/drawing/2015/10/21/chartex" xmlns:cx3="http://schemas.microsoft.com/office/drawing/2016/5/9/chartex" xmlns:cx4="http://schemas.microsoft.com/office/drawing/2016/5/10/chartex" xmlns:cx5="http://schemas.microsoft.com/office/drawing/2016/5/11/chartex" xmlns:cx6="http://schemas.microsoft.com/office/drawing/2016/5/12/chartex" xmlns:cx7="http://schemas.microsoft.com/office/drawing/2016/5/13/chartex" xmlns:cx8="http://schemas.microsoft.com/office/drawing/2016/5/14/chartex" xmlns:mc="http://schemas.openxmlformats.org/markup-compatibility/2006" xmlns:aink="http://schemas.microsoft.com/office/drawing/2016/ink" xmlns:am3d="http://schemas.microsoft.com/office/drawing/2017/model3d" xmlns:o="urn:schemas-microsoft-com:office:office" xmlns:oel="http://schemas.microsoft.com/office/2019/extlst" xmlns:r="http://schemas.openxmlformats.org/officeDocument/2006/relationships" xmlns:m="http://schemas.openxmlformats.org/officeDocument/2006/math" xmlns:v="urn:schemas-microsoft-com:vml" xmlns:wp14="http://schemas.microsoft.com/office/word/2010/wordprocessingDrawing" xmlns:wp="http://schemas.openxmlformats.org/drawingml/2006/wordprocessingDrawing" xmlns:w10="urn:schemas-microsoft-com:office:word" xmlns:w="http://schemas.openxmlformats.org/wordprocessingml/2006/main" xmlns:w14="http://schemas.microsoft.com/office/word/2010/wordml" xmlns:w15="http://schemas.microsoft.com/office/word/2012/wordml" xmlns:w16cei="http://schemas.microsoft.com/office/word/2026/wordml/cei" xmlns:w16cex="http://schemas.microsoft.com/office/word/2018/wordml/cex" xmlns:w16cid="http://schemas.microsoft.com/office/word/2016/wordml/cid" xmlns:w16="http://schemas.microsoft.com/office/word/2018/wordml" xmlns:w16du="http://schemas.microsoft.com/office/word/2023/wordml/word16du" xmlns:w16sdtdh="http://schemas.microsoft.com/office/word/2020/wordml/sdtdatahash" xmlns:w16sdtfl="http://schemas.microsoft.com/office/word/2024/wordml/sdtformatlock" xmlns:w16se="http://schemas.microsoft.com/office/word/2015/wordml/symex" xmlns:wpg="http://schemas.microsoft.com/office/word/2010/wordprocessingGroup" xmlns:wpi="http://schemas.microsoft.com/office/word/2010/wordprocessingInk" xmlns:wne="http://schemas.microsoft.com/office/word/2006/wordml" xmlns:wps="http://schemas.microsoft.com/office/word/2010/wordprocessingShape" mc:Ignorable="w14 w15 w16se w16cid w16 w16cex w16sdtdh w16sdtfl w16du wp14">
   <w:body>
     <w:p>
       <w:pPr>
@@ -67,7 +67,7 @@
         <w:rPr>
           <w:noProof/>
         </w:rPr>
-        <w:t>25/03/2026 10:28:11</w:t>
+        <w:t>17/08/2026 10:28:07</w:t>
       </w:r>
       <w:r>
         <w:fldChar w:fldCharType="end"/>
@@ -129,7 +129,7 @@
           <w:rPr>
             <w:rStyle w:val="Hyperlink"/>
           </w:rPr>
-          <w:t>https://github.com/ScotMarPhys/m_moorproc_toolbox/tree/dy181_RHADCP</w:t>
+          <w:t>https://github.com/ScotMarPhys/m_moorproc_toolbox/main/</w:t>
         </w:r>
       </w:hyperlink>
     </w:p>
@@ -584,7 +584,7 @@
           <w:iCs/>
           <w:color w:val="4C94D8" w:themeColor="text2" w:themeTint="80"/>
         </w:rPr>
-        <w:t>\osnap\data\moor\raw\cruise_id\adcp_s55</w:t>
+        <w:t>\osnap\</w:t>
       </w:r>
       <w:r>
         <w:rPr>
@@ -592,6 +592,30 @@
           <w:iCs/>
           <w:color w:val="4C94D8" w:themeColor="text2" w:themeTint="80"/>
         </w:rPr>
+        <w:t>mooring</w:t>
+      </w:r>
+      <w:r>
+        <w:rPr>
+          <w:i/>
+          <w:iCs/>
+          <w:color w:val="4C94D8" w:themeColor="text2" w:themeTint="80"/>
+        </w:rPr>
+        <w:t>s</w:t>
+      </w:r>
+      <w:r>
+        <w:rPr>
+          <w:i/>
+          <w:iCs/>
+          <w:color w:val="4C94D8" w:themeColor="text2" w:themeTint="80"/>
+        </w:rPr>
+        <w:t>\raw\cruise_id\adcp_s55</w:t>
+      </w:r>
+      <w:r>
+        <w:rPr>
+          <w:i/>
+          <w:iCs/>
+          <w:color w:val="4C94D8" w:themeColor="text2" w:themeTint="80"/>
+        </w:rPr>
         <w:t>\</w:t>
       </w:r>
     </w:p>
@@ -610,7 +634,7 @@
           <w:iCs/>
           <w:color w:val="4C94D8" w:themeColor="text2" w:themeTint="80"/>
         </w:rPr>
-        <w:t>osnap\data\moor\raw\jc238\adcp_s55</w:t>
+        <w:t>osnap\</w:t>
       </w:r>
       <w:r>
         <w:rPr>
@@ -618,6 +642,22 @@
           <w:iCs/>
           <w:color w:val="4C94D8" w:themeColor="text2" w:themeTint="80"/>
         </w:rPr>
+        <w:t>moorings</w:t>
+      </w:r>
+      <w:r>
+        <w:rPr>
+          <w:i/>
+          <w:iCs/>
+          <w:color w:val="4C94D8" w:themeColor="text2" w:themeTint="80"/>
+        </w:rPr>
+        <w:t>\raw\jc238\adcp_s55</w:t>
+      </w:r>
+      <w:r>
+        <w:rPr>
+          <w:i/>
+          <w:iCs/>
+          <w:color w:val="4C94D8" w:themeColor="text2" w:themeTint="80"/>
+        </w:rPr>
         <w:t>\</w:t>
       </w:r>
     </w:p>
@@ -693,7 +733,7 @@
           <w:iCs/>
           <w:color w:val="4C94D8" w:themeColor="text2" w:themeTint="80"/>
         </w:rPr>
-        <w:t>osnap/data/moor/proc/</w:t>
+        <w:t>osnap/</w:t>
       </w:r>
       <w:r>
         <w:rPr>
@@ -701,6 +741,22 @@
           <w:iCs/>
           <w:color w:val="4C94D8" w:themeColor="text2" w:themeTint="80"/>
         </w:rPr>
+        <w:t>moorings</w:t>
+      </w:r>
+      <w:r>
+        <w:rPr>
+          <w:i/>
+          <w:iCs/>
+          <w:color w:val="4C94D8" w:themeColor="text2" w:themeTint="80"/>
+        </w:rPr>
+        <w:t>/proc/</w:t>
+      </w:r>
+      <w:r>
+        <w:rPr>
+          <w:i/>
+          <w:iCs/>
+          <w:color w:val="4C94D8" w:themeColor="text2" w:themeTint="80"/>
+        </w:rPr>
         <w:t>[</w:t>
       </w:r>
       <w:r>
@@ -808,7 +864,23 @@
           <w:iCs/>
           <w:color w:val="3A7C22" w:themeColor="accent6" w:themeShade="BF"/>
         </w:rPr>
-        <w:t>osnap\data\moor\proc\rhadcp_01_2020\</w:t>
+        <w:t>osnap\</w:t>
+      </w:r>
+      <w:r>
+        <w:rPr>
+          <w:i/>
+          <w:iCs/>
+          <w:color w:val="3A7C22" w:themeColor="accent6" w:themeShade="BF"/>
+        </w:rPr>
+        <w:t>moorings</w:t>
+      </w:r>
+      <w:r>
+        <w:rPr>
+          <w:i/>
+          <w:iCs/>
+          <w:color w:val="3A7C22" w:themeColor="accent6" w:themeShade="BF"/>
+        </w:rPr>
+        <w:t>\proc\rhadcp_01_2020\</w:t>
       </w:r>
       <w:r>
         <w:rPr>
@@ -1740,7 +1812,7 @@
           <w:color w:val="4C94D8" w:themeColor="text2" w:themeTint="80"/>
           <w:lang w:val="en-US"/>
         </w:rPr>
-        <w:t>data</w:t>
+        <w:t>moorings</w:t>
       </w:r>
       <w:r>
         <w:rPr>
@@ -1758,7 +1830,7 @@
           <w:color w:val="4C94D8" w:themeColor="text2" w:themeTint="80"/>
           <w:lang w:val="en-US"/>
         </w:rPr>
-        <w:t>moor</w:t>
+        <w:t>proc</w:t>
       </w:r>
       <w:r>
         <w:rPr>
@@ -1776,7 +1848,7 @@
           <w:color w:val="4C94D8" w:themeColor="text2" w:themeTint="80"/>
           <w:lang w:val="en-US"/>
         </w:rPr>
-        <w:t>proc</w:t>
+        <w:t>moor_id</w:t>
       </w:r>
       <w:r>
         <w:rPr>
@@ -1794,7 +1866,7 @@
           <w:color w:val="4C94D8" w:themeColor="text2" w:themeTint="80"/>
           <w:lang w:val="en-US"/>
         </w:rPr>
-        <w:t>moor_id</w:t>
+        <w:t>adcp_S55</w:t>
       </w:r>
       <w:r>
         <w:rPr>
@@ -1805,6 +1877,22 @@
         </w:rPr>
         <w:t>\</w:t>
       </w:r>
+    </w:p>
+    <w:p>
+      <w:pPr>
+        <w:rPr>
+          <w:i/>
+          <w:iCs/>
+          <w:color w:val="4EA72E" w:themeColor="accent6"/>
+          <w:lang w:val="en-US"/>
+        </w:rPr>
+      </w:pPr>
+      <w:r>
+        <w:rPr>
+          <w:lang w:val="en-US"/>
+        </w:rPr>
+        <w:t xml:space="preserve">E.g. for JC238:  </w:t>
+      </w:r>
       <w:r>
         <w:rPr>
           <w:i/>
@@ -1812,7 +1900,7 @@
           <w:color w:val="4C94D8" w:themeColor="text2" w:themeTint="80"/>
           <w:lang w:val="en-US"/>
         </w:rPr>
-        <w:t>adcp_S55</w:t>
+        <w:t>osnap\</w:t>
       </w:r>
       <w:r>
         <w:rPr>
@@ -1821,23 +1909,7 @@
           <w:color w:val="4C94D8" w:themeColor="text2" w:themeTint="80"/>
           <w:lang w:val="en-US"/>
         </w:rPr>
-        <w:t>\</w:t>
-      </w:r>
-    </w:p>
-    <w:p>
-      <w:pPr>
-        <w:rPr>
-          <w:i/>
-          <w:iCs/>
-          <w:color w:val="4EA72E" w:themeColor="accent6"/>
-          <w:lang w:val="en-US"/>
-        </w:rPr>
-      </w:pPr>
-      <w:r>
-        <w:rPr>
-          <w:lang w:val="en-US"/>
-        </w:rPr>
-        <w:t xml:space="preserve">E.g. for JC238:  </w:t>
+        <w:t>moorings</w:t>
       </w:r>
       <w:r>
         <w:rPr>
@@ -1846,7 +1918,7 @@
           <w:color w:val="4C94D8" w:themeColor="text2" w:themeTint="80"/>
           <w:lang w:val="en-US"/>
         </w:rPr>
-        <w:t>osnap\data\moor\proc\rhadcp_01_2020\adcp_S55\</w:t>
+        <w:t>\proc\rhadcp_01_2020\adcp_S55\</w:t>
       </w:r>
     </w:p>
     <w:p>
@@ -5616,7 +5688,7 @@
           <w:color w:val="4C94D8" w:themeColor="text2" w:themeTint="80"/>
           <w:lang w:val="en-US"/>
         </w:rPr>
-        <w:t>data</w:t>
+        <w:t>moorings</w:t>
       </w:r>
       <w:r>
         <w:rPr>
@@ -5634,7 +5706,7 @@
           <w:color w:val="4C94D8" w:themeColor="text2" w:themeTint="80"/>
           <w:lang w:val="en-US"/>
         </w:rPr>
-        <w:t>moor</w:t>
+        <w:t>proc</w:t>
       </w:r>
       <w:r>
         <w:rPr>
@@ -5652,7 +5724,7 @@
           <w:color w:val="4C94D8" w:themeColor="text2" w:themeTint="80"/>
           <w:lang w:val="en-US"/>
         </w:rPr>
-        <w:t>proc</w:t>
+        <w:t>moor_id</w:t>
       </w:r>
       <w:r>
         <w:rPr>
@@ -5670,7 +5742,7 @@
           <w:color w:val="4C94D8" w:themeColor="text2" w:themeTint="80"/>
           <w:lang w:val="en-US"/>
         </w:rPr>
-        <w:t>moor_id</w:t>
+        <w:t>adcp_S55</w:t>
       </w:r>
       <w:r>
         <w:rPr>
@@ -5681,6 +5753,22 @@
         </w:rPr>
         <w:t>\</w:t>
       </w:r>
+    </w:p>
+    <w:p>
+      <w:pPr>
+        <w:rPr>
+          <w:i/>
+          <w:iCs/>
+          <w:color w:val="4EA72E" w:themeColor="accent6"/>
+          <w:lang w:val="en-US"/>
+        </w:rPr>
+      </w:pPr>
+      <w:r>
+        <w:rPr>
+          <w:lang w:val="en-US"/>
+        </w:rPr>
+        <w:t xml:space="preserve">E.g. for JC238:  </w:t>
+      </w:r>
       <w:r>
         <w:rPr>
           <w:i/>
@@ -5688,7 +5776,7 @@
           <w:color w:val="4C94D8" w:themeColor="text2" w:themeTint="80"/>
           <w:lang w:val="en-US"/>
         </w:rPr>
-        <w:t>adcp_S55</w:t>
+        <w:t>osnap\</w:t>
       </w:r>
       <w:r>
         <w:rPr>
@@ -5697,23 +5785,7 @@
           <w:color w:val="4C94D8" w:themeColor="text2" w:themeTint="80"/>
           <w:lang w:val="en-US"/>
         </w:rPr>
-        <w:t>\</w:t>
-      </w:r>
-    </w:p>
-    <w:p>
-      <w:pPr>
-        <w:rPr>
-          <w:i/>
-          <w:iCs/>
-          <w:color w:val="4EA72E" w:themeColor="accent6"/>
-          <w:lang w:val="en-US"/>
-        </w:rPr>
-      </w:pPr>
-      <w:r>
-        <w:rPr>
-          <w:lang w:val="en-US"/>
-        </w:rPr>
-        <w:t xml:space="preserve">E.g. for JC238:  </w:t>
+        <w:t>moorings</w:t>
       </w:r>
       <w:r>
         <w:rPr>
@@ -5722,7 +5794,7 @@
           <w:color w:val="4C94D8" w:themeColor="text2" w:themeTint="80"/>
           <w:lang w:val="en-US"/>
         </w:rPr>
-        <w:t>osnap\data\moor\proc\rhadcp_01_2020\adcp_S55\</w:t>
+        <w:t>\proc\rhadcp_01_2020\adcp_S55\</w:t>
       </w:r>
     </w:p>
     <w:p>
@@ -9984,7 +10056,7 @@
 </file>
 
 <file path=word/comments.xml><?xml version="1.0" encoding="utf-8"?>
-<w:comments xmlns:wpc="http://schemas.microsoft.com/office/word/2010/wordprocessingCanvas" xmlns:cx="http://schemas.microsoft.com/office/drawing/2014/chartex" xmlns:cx1="http://schemas.microsoft.com/office/drawing/2015/9/8/chartex" xmlns:cx2="http://schemas.microsoft.com/office/drawing/2015/10/21/chartex" xmlns:cx3="http://schemas.microsoft.com/office/drawing/2016/5/9/chartex" xmlns:cx4="http://schemas.microsoft.com/office/drawing/2016/5/10/chartex" xmlns:cx5="http://schemas.microsoft.com/office/drawing/2016/5/11/chartex" xmlns:cx6="http://schemas.microsoft.com/office/drawing/2016/5/12/chartex" xmlns:cx7="http://schemas.microsoft.com/office/drawing/2016/5/13/chartex" xmlns:cx8="http://schemas.microsoft.com/office/drawing/2016/5/14/chartex" xmlns:mc="http://schemas.openxmlformats.org/markup-compatibility/2006" xmlns:aink="http://schemas.microsoft.com/office/drawing/2016/ink" xmlns:am3d="http://schemas.microsoft.com/office/drawing/2017/model3d" xmlns:o="urn:schemas-microsoft-com:office:office" xmlns:oel="http://schemas.microsoft.com/office/2019/extlst" xmlns:r="http://schemas.openxmlformats.org/officeDocument/2006/relationships" xmlns:m="http://schemas.openxmlformats.org/officeDocument/2006/math" xmlns:v="urn:schemas-microsoft-com:vml" xmlns:wp14="http://schemas.microsoft.com/office/word/2010/wordprocessingDrawing" xmlns:wp="http://schemas.openxmlformats.org/drawingml/2006/wordprocessingDrawing" xmlns:w10="urn:schemas-microsoft-com:office:word" xmlns:w="http://schemas.openxmlformats.org/wordprocessingml/2006/main" xmlns:w14="http://schemas.microsoft.com/office/word/2010/wordml" xmlns:w15="http://schemas.microsoft.com/office/word/2012/wordml" xmlns:w16cex="http://schemas.microsoft.com/office/word/2018/wordml/cex" xmlns:w16cid="http://schemas.microsoft.com/office/word/2016/wordml/cid" xmlns:w16="http://schemas.microsoft.com/office/word/2018/wordml" xmlns:w16du="http://schemas.microsoft.com/office/word/2023/wordml/word16du" xmlns:w16sdtdh="http://schemas.microsoft.com/office/word/2020/wordml/sdtdatahash" xmlns:w16sdtfl="http://schemas.microsoft.com/office/word/2024/wordml/sdtformatlock" xmlns:w16se="http://schemas.microsoft.com/office/word/2015/wordml/symex" xmlns:wpg="http://schemas.microsoft.com/office/word/2010/wordprocessingGroup" xmlns:wpi="http://schemas.microsoft.com/office/word/2010/wordprocessingInk" xmlns:wne="http://schemas.microsoft.com/office/word/2006/wordml" xmlns:wps="http://schemas.microsoft.com/office/word/2010/wordprocessingShape" mc:Ignorable="w14 w15 w16se w16cid w16 w16cex w16sdtdh w16sdtfl w16du wp14">
+<w:comments xmlns:wpc="http://schemas.microsoft.com/office/word/2010/wordprocessingCanvas" xmlns:cx="http://schemas.microsoft.com/office/drawing/2014/chartex" xmlns:cx1="http://schemas.microsoft.com/office/drawing/2015/9/8/chartex" xmlns:cx2="http://schemas.microsoft.com/office/drawing/2015/10/21/chartex" xmlns:cx3="http://schemas.microsoft.com/office/drawing/2016/5/9/chartex" xmlns:cx4="http://schemas.microsoft.com/office/drawing/2016/5/10/chartex" xmlns:cx5="http://schemas.microsoft.com/office/drawing/2016/5/11/chartex" xmlns:cx6="http://schemas.microsoft.com/office/drawing/2016/5/12/chartex" xmlns:cx7="http://schemas.microsoft.com/office/drawing/2016/5/13/chartex" xmlns:cx8="http://schemas.microsoft.com/office/drawing/2016/5/14/chartex" xmlns:mc="http://schemas.openxmlformats.org/markup-compatibility/2006" xmlns:aink="http://schemas.microsoft.com/office/drawing/2016/ink" xmlns:am3d="http://schemas.microsoft.com/office/drawing/2017/model3d" xmlns:o="urn:schemas-microsoft-com:office:office" xmlns:oel="http://schemas.microsoft.com/office/2019/extlst" xmlns:r="http://schemas.openxmlformats.org/officeDocument/2006/relationships" xmlns:m="http://schemas.openxmlformats.org/officeDocument/2006/math" xmlns:v="urn:schemas-microsoft-com:vml" xmlns:wp14="http://schemas.microsoft.com/office/word/2010/wordprocessingDrawing" xmlns:wp="http://schemas.openxmlformats.org/drawingml/2006/wordprocessingDrawing" xmlns:w10="urn:schemas-microsoft-com:office:word" xmlns:w="http://schemas.openxmlformats.org/wordprocessingml/2006/main" xmlns:w14="http://schemas.microsoft.com/office/word/2010/wordml" xmlns:w15="http://schemas.microsoft.com/office/word/2012/wordml" xmlns:w16cei="http://schemas.microsoft.com/office/word/2026/wordml/cei" xmlns:w16cex="http://schemas.microsoft.com/office/word/2018/wordml/cex" xmlns:w16cid="http://schemas.microsoft.com/office/word/2016/wordml/cid" xmlns:w16="http://schemas.microsoft.com/office/word/2018/wordml" xmlns:w16du="http://schemas.microsoft.com/office/word/2023/wordml/word16du" xmlns:w16sdtdh="http://schemas.microsoft.com/office/word/2020/wordml/sdtdatahash" xmlns:w16sdtfl="http://schemas.microsoft.com/office/word/2024/wordml/sdtformatlock" xmlns:w16se="http://schemas.microsoft.com/office/word/2015/wordml/symex" xmlns:wpg="http://schemas.microsoft.com/office/word/2010/wordprocessingGroup" xmlns:wpi="http://schemas.microsoft.com/office/word/2010/wordprocessingInk" xmlns:wne="http://schemas.microsoft.com/office/word/2006/wordml" xmlns:wps="http://schemas.microsoft.com/office/word/2010/wordprocessingShape" mc:Ignorable="w14 w15 w16se w16cid w16 w16cex w16sdtdh w16sdtfl w16du wp14">
   <w:comment w:id="0" w:author="Kristin Burmeister" w:date="2026-01-27T15:46:00Z" w:initials="KB">
     <w:p>
       <w:pPr>
@@ -10112,7 +10184,7 @@
 </file>
 
 <file path=word/commentsExtended.xml><?xml version="1.0" encoding="utf-8"?>
-<w15:commentsEx xmlns:wpc="http://schemas.microsoft.com/office/word/2010/wordprocessingCanvas" xmlns:cx="http://schemas.microsoft.com/office/drawing/2014/chartex" xmlns:cx1="http://schemas.microsoft.com/office/drawing/2015/9/8/chartex" xmlns:cx2="http://schemas.microsoft.com/office/drawing/2015/10/21/chartex" xmlns:cx3="http://schemas.microsoft.com/office/drawing/2016/5/9/chartex" xmlns:cx4="http://schemas.microsoft.com/office/drawing/2016/5/10/chartex" xmlns:cx5="http://schemas.microsoft.com/office/drawing/2016/5/11/chartex" xmlns:cx6="http://schemas.microsoft.com/office/drawing/2016/5/12/chartex" xmlns:cx7="http://schemas.microsoft.com/office/drawing/2016/5/13/chartex" xmlns:cx8="http://schemas.microsoft.com/office/drawing/2016/5/14/chartex" xmlns:mc="http://schemas.openxmlformats.org/markup-compatibility/2006" xmlns:aink="http://schemas.microsoft.com/office/drawing/2016/ink" xmlns:am3d="http://schemas.microsoft.com/office/drawing/2017/model3d" xmlns:o="urn:schemas-microsoft-com:office:office" xmlns:oel="http://schemas.microsoft.com/office/2019/extlst" xmlns:r="http://schemas.openxmlformats.org/officeDocument/2006/relationships" xmlns:m="http://schemas.openxmlformats.org/officeDocument/2006/math" xmlns:v="urn:schemas-microsoft-com:vml" xmlns:wp14="http://schemas.microsoft.com/office/word/2010/wordprocessingDrawing" xmlns:wp="http://schemas.openxmlformats.org/drawingml/2006/wordprocessingDrawing" xmlns:w10="urn:schemas-microsoft-com:office:word" xmlns:w="http://schemas.openxmlformats.org/wordprocessingml/2006/main" xmlns:w14="http://schemas.microsoft.com/office/word/2010/wordml" xmlns:w15="http://schemas.microsoft.com/office/word/2012/wordml" xmlns:w16cex="http://schemas.microsoft.com/office/word/2018/wordml/cex" xmlns:w16cid="http://schemas.microsoft.com/office/word/2016/wordml/cid" xmlns:w16="http://schemas.microsoft.com/office/word/2018/wordml" xmlns:w16du="http://schemas.microsoft.com/office/word/2023/wordml/word16du" xmlns:w16sdtdh="http://schemas.microsoft.com/office/word/2020/wordml/sdtdatahash" xmlns:w16sdtfl="http://schemas.microsoft.com/office/word/2024/wordml/sdtformatlock" xmlns:w16se="http://schemas.microsoft.com/office/word/2015/wordml/symex" xmlns:wpg="http://schemas.microsoft.com/office/word/2010/wordprocessingGroup" xmlns:wpi="http://schemas.microsoft.com/office/word/2010/wordprocessingInk" xmlns:wne="http://schemas.microsoft.com/office/word/2006/wordml" xmlns:wps="http://schemas.microsoft.com/office/word/2010/wordprocessingShape" mc:Ignorable="w14 w15 w16se w16cid w16 w16cex w16sdtdh w16sdtfl w16du wp14">
+<w15:commentsEx xmlns:wpc="http://schemas.microsoft.com/office/word/2010/wordprocessingCanvas" xmlns:cx="http://schemas.microsoft.com/office/drawing/2014/chartex" xmlns:cx1="http://schemas.microsoft.com/office/drawing/2015/9/8/chartex" xmlns:cx2="http://schemas.microsoft.com/office/drawing/2015/10/21/chartex" xmlns:cx3="http://schemas.microsoft.com/office/drawing/2016/5/9/chartex" xmlns:cx4="http://schemas.microsoft.com/office/drawing/2016/5/10/chartex" xmlns:cx5="http://schemas.microsoft.com/office/drawing/2016/5/11/chartex" xmlns:cx6="http://schemas.microsoft.com/office/drawing/2016/5/12/chartex" xmlns:cx7="http://schemas.microsoft.com/office/drawing/2016/5/13/chartex" xmlns:cx8="http://schemas.microsoft.com/office/drawing/2016/5/14/chartex" xmlns:mc="http://schemas.openxmlformats.org/markup-compatibility/2006" xmlns:aink="http://schemas.microsoft.com/office/drawing/2016/ink" xmlns:am3d="http://schemas.microsoft.com/office/drawing/2017/model3d" xmlns:o="urn:schemas-microsoft-com:office:office" xmlns:oel="http://schemas.microsoft.com/office/2019/extlst" xmlns:r="http://schemas.openxmlformats.org/officeDocument/2006/relationships" xmlns:m="http://schemas.openxmlformats.org/officeDocument/2006/math" xmlns:v="urn:schemas-microsoft-com:vml" xmlns:wp14="http://schemas.microsoft.com/office/word/2010/wordprocessingDrawing" xmlns:wp="http://schemas.openxmlformats.org/drawingml/2006/wordprocessingDrawing" xmlns:w10="urn:schemas-microsoft-com:office:word" xmlns:w="http://schemas.openxmlformats.org/wordprocessingml/2006/main" xmlns:w14="http://schemas.microsoft.com/office/word/2010/wordml" xmlns:w15="http://schemas.microsoft.com/office/word/2012/wordml" xmlns:w16cei="http://schemas.microsoft.com/office/word/2026/wordml/cei" xmlns:w16cex="http://schemas.microsoft.com/office/word/2018/wordml/cex" xmlns:w16cid="http://schemas.microsoft.com/office/word/2016/wordml/cid" xmlns:w16="http://schemas.microsoft.com/office/word/2018/wordml" xmlns:w16du="http://schemas.microsoft.com/office/word/2023/wordml/word16du" xmlns:w16sdtdh="http://schemas.microsoft.com/office/word/2020/wordml/sdtdatahash" xmlns:w16sdtfl="http://schemas.microsoft.com/office/word/2024/wordml/sdtformatlock" xmlns:w16se="http://schemas.microsoft.com/office/word/2015/wordml/symex" xmlns:wpg="http://schemas.microsoft.com/office/word/2010/wordprocessingGroup" xmlns:wpi="http://schemas.microsoft.com/office/word/2010/wordprocessingInk" xmlns:wne="http://schemas.microsoft.com/office/word/2006/wordml" xmlns:wps="http://schemas.microsoft.com/office/word/2010/wordprocessingShape" mc:Ignorable="w14 w15 w16se w16cid w16 w16cex w16sdtdh w16sdtfl w16du wp14">
   <w15:commentEx w15:paraId="729F0B3C" w15:done="0"/>
   <w15:commentEx w15:paraId="40C61E6C" w15:done="0"/>
   <w15:commentEx w15:paraId="30603793" w15:paraIdParent="40C61E6C" w15:done="0"/>
@@ -10123,7 +10195,7 @@
 </file>
 
 <file path=word/commentsExtensible.xml><?xml version="1.0" encoding="utf-8"?>
-<w16cex:commentsExtensible xmlns:wpc="http://schemas.microsoft.com/office/word/2010/wordprocessingCanvas" xmlns:cx="http://schemas.microsoft.com/office/drawing/2014/chartex" xmlns:cx1="http://schemas.microsoft.com/office/drawing/2015/9/8/chartex" xmlns:cx2="http://schemas.microsoft.com/office/drawing/2015/10/21/chartex" xmlns:cx3="http://schemas.microsoft.com/office/drawing/2016/5/9/chartex" xmlns:cx4="http://schemas.microsoft.com/office/drawing/2016/5/10/chartex" xmlns:cx5="http://schemas.microsoft.com/office/drawing/2016/5/11/chartex" xmlns:cx6="http://schemas.microsoft.com/office/drawing/2016/5/12/chartex" xmlns:cx7="http://schemas.microsoft.com/office/drawing/2016/5/13/chartex" xmlns:cx8="http://schemas.microsoft.com/office/drawing/2016/5/14/chartex" xmlns:cr="http://schemas.microsoft.com/office/comments/2020/reactions" xmlns:mc="http://schemas.openxmlformats.org/markup-compatibility/2006" xmlns:aink="http://schemas.microsoft.com/office/drawing/2016/ink" xmlns:am3d="http://schemas.microsoft.com/office/drawing/2017/model3d" xmlns:o="urn:schemas-microsoft-com:office:office" xmlns:oel="http://schemas.microsoft.com/office/2019/extlst" xmlns:r="http://schemas.openxmlformats.org/officeDocument/2006/relationships" xmlns:m="http://schemas.openxmlformats.org/officeDocument/2006/math" xmlns:v="urn:schemas-microsoft-com:vml" xmlns:wp14="http://schemas.microsoft.com/office/word/2010/wordprocessingDrawing" xmlns:wp="http://schemas.openxmlformats.org/drawingml/2006/wordprocessingDrawing" xmlns:w10="urn:schemas-microsoft-com:office:word" xmlns:w="http://schemas.openxmlformats.org/wordprocessingml/2006/main" xmlns:w14="http://schemas.microsoft.com/office/word/2010/wordml" xmlns:w15="http://schemas.microsoft.com/office/word/2012/wordml" xmlns:w16cex="http://schemas.microsoft.com/office/word/2018/wordml/cex" xmlns:w16cid="http://schemas.microsoft.com/office/word/2016/wordml/cid" xmlns:w16="http://schemas.microsoft.com/office/word/2018/wordml" xmlns:w16du="http://schemas.microsoft.com/office/word/2023/wordml/word16du" xmlns:w16sdtdh="http://schemas.microsoft.com/office/word/2020/wordml/sdtdatahash" xmlns:w16sdtfl="http://schemas.microsoft.com/office/word/2024/wordml/sdtformatlock" xmlns:w16se="http://schemas.microsoft.com/office/word/2015/wordml/symex" xmlns:wpg="http://schemas.microsoft.com/office/word/2010/wordprocessingGroup" xmlns:wpi="http://schemas.microsoft.com/office/word/2010/wordprocessingInk" xmlns:wne="http://schemas.microsoft.com/office/word/2006/wordml" xmlns:wps="http://schemas.microsoft.com/office/word/2010/wordprocessingShape" mc:Ignorable="w14 w15 w16se w16cid w16 w16cex w16sdtdh w16sdtfl cr w16du wp14">
+<w16cex:commentsExtensible xmlns:wpc="http://schemas.microsoft.com/office/word/2010/wordprocessingCanvas" xmlns:cx="http://schemas.microsoft.com/office/drawing/2014/chartex" xmlns:cx1="http://schemas.microsoft.com/office/drawing/2015/9/8/chartex" xmlns:cx2="http://schemas.microsoft.com/office/drawing/2015/10/21/chartex" xmlns:cx3="http://schemas.microsoft.com/office/drawing/2016/5/9/chartex" xmlns:cx4="http://schemas.microsoft.com/office/drawing/2016/5/10/chartex" xmlns:cx5="http://schemas.microsoft.com/office/drawing/2016/5/11/chartex" xmlns:cx6="http://schemas.microsoft.com/office/drawing/2016/5/12/chartex" xmlns:cx7="http://schemas.microsoft.com/office/drawing/2016/5/13/chartex" xmlns:cx8="http://schemas.microsoft.com/office/drawing/2016/5/14/chartex" xmlns:cr="http://schemas.microsoft.com/office/comments/2020/reactions" xmlns:mc="http://schemas.openxmlformats.org/markup-compatibility/2006" xmlns:aink="http://schemas.microsoft.com/office/drawing/2016/ink" xmlns:am3d="http://schemas.microsoft.com/office/drawing/2017/model3d" xmlns:o="urn:schemas-microsoft-com:office:office" xmlns:oel="http://schemas.microsoft.com/office/2019/extlst" xmlns:r="http://schemas.openxmlformats.org/officeDocument/2006/relationships" xmlns:m="http://schemas.openxmlformats.org/officeDocument/2006/math" xmlns:v="urn:schemas-microsoft-com:vml" xmlns:wp14="http://schemas.microsoft.com/office/word/2010/wordprocessingDrawing" xmlns:wp="http://schemas.openxmlformats.org/drawingml/2006/wordprocessingDrawing" xmlns:w10="urn:schemas-microsoft-com:office:word" xmlns:w="http://schemas.openxmlformats.org/wordprocessingml/2006/main" xmlns:w14="http://schemas.microsoft.com/office/word/2010/wordml" xmlns:w15="http://schemas.microsoft.com/office/word/2012/wordml" xmlns:w16cei="http://schemas.microsoft.com/office/word/2026/wordml/cei" xmlns:w16cex="http://schemas.microsoft.com/office/word/2018/wordml/cex" xmlns:w16cid="http://schemas.microsoft.com/office/word/2016/wordml/cid" xmlns:w16="http://schemas.microsoft.com/office/word/2018/wordml" xmlns:w16du="http://schemas.microsoft.com/office/word/2023/wordml/word16du" xmlns:w16sdtdh="http://schemas.microsoft.com/office/word/2020/wordml/sdtdatahash" xmlns:w16sdtfl="http://schemas.microsoft.com/office/word/2024/wordml/sdtformatlock" xmlns:w16se="http://schemas.microsoft.com/office/word/2015/wordml/symex" xmlns:wpg="http://schemas.microsoft.com/office/word/2010/wordprocessingGroup" xmlns:wpi="http://schemas.microsoft.com/office/word/2010/wordprocessingInk" xmlns:wne="http://schemas.microsoft.com/office/word/2006/wordml" xmlns:wps="http://schemas.microsoft.com/office/word/2010/wordprocessingShape" mc:Ignorable="w14 w15 w16se w16cid w16 w16cex w16sdtdh w16sdtfl cr w16du wp14">
   <w16cex:commentExtensible w16cex:durableId="669924E6" w16cex:dateUtc="2026-01-27T02:46:00Z"/>
   <w16cex:commentExtensible w16cex:durableId="2BBC945F" w16cex:dateUtc="2026-01-06T03:47:00Z"/>
   <w16cex:commentExtensible w16cex:durableId="6BF40AD2" w16cex:dateUtc="2026-01-06T03:48:00Z"/>
@@ -10134,7 +10206,7 @@
 </file>
 
 <file path=word/commentsIds.xml><?xml version="1.0" encoding="utf-8"?>
-<w16cid:commentsIds xmlns:wpc="http://schemas.microsoft.com/office/word/2010/wordprocessingCanvas" xmlns:cx="http://schemas.microsoft.com/office/drawing/2014/chartex" xmlns:cx1="http://schemas.microsoft.com/office/drawing/2015/9/8/chartex" xmlns:cx2="http://schemas.microsoft.com/office/drawing/2015/10/21/chartex" xmlns:cx3="http://schemas.microsoft.com/office/drawing/2016/5/9/chartex" xmlns:cx4="http://schemas.microsoft.com/office/drawing/2016/5/10/chartex" xmlns:cx5="http://schemas.microsoft.com/office/drawing/2016/5/11/chartex" xmlns:cx6="http://schemas.microsoft.com/office/drawing/2016/5/12/chartex" xmlns:cx7="http://schemas.microsoft.com/office/drawing/2016/5/13/chartex" xmlns:cx8="http://schemas.microsoft.com/office/drawing/2016/5/14/chartex" xmlns:mc="http://schemas.openxmlformats.org/markup-compatibility/2006" xmlns:aink="http://schemas.microsoft.com/office/drawing/2016/ink" xmlns:am3d="http://schemas.microsoft.com/office/drawing/2017/model3d" xmlns:o="urn:schemas-microsoft-com:office:office" xmlns:oel="http://schemas.microsoft.com/office/2019/extlst" xmlns:r="http://schemas.openxmlformats.org/officeDocument/2006/relationships" xmlns:m="http://schemas.openxmlformats.org/officeDocument/2006/math" xmlns:v="urn:schemas-microsoft-com:vml" xmlns:wp14="http://schemas.microsoft.com/office/word/2010/wordprocessingDrawing" xmlns:wp="http://schemas.openxmlformats.org/drawingml/2006/wordprocessingDrawing" xmlns:w10="urn:schemas-microsoft-com:office:word" xmlns:w="http://schemas.openxmlformats.org/wordprocessingml/2006/main" xmlns:w14="http://schemas.microsoft.com/office/word/2010/wordml" xmlns:w15="http://schemas.microsoft.com/office/word/2012/wordml" xmlns:w16cex="http://schemas.microsoft.com/office/word/2018/wordml/cex" xmlns:w16cid="http://schemas.microsoft.com/office/word/2016/wordml/cid" xmlns:w16="http://schemas.microsoft.com/office/word/2018/wordml" xmlns:w16du="http://schemas.microsoft.com/office/word/2023/wordml/word16du" xmlns:w16sdtdh="http://schemas.microsoft.com/office/word/2020/wordml/sdtdatahash" xmlns:w16sdtfl="http://schemas.microsoft.com/office/word/2024/wordml/sdtformatlock" xmlns:w16se="http://schemas.microsoft.com/office/word/2015/wordml/symex" xmlns:wpg="http://schemas.microsoft.com/office/word/2010/wordprocessingGroup" xmlns:wpi="http://schemas.microsoft.com/office/word/2010/wordprocessingInk" xmlns:wne="http://schemas.microsoft.com/office/word/2006/wordml" xmlns:wps="http://schemas.microsoft.com/office/word/2010/wordprocessingShape" mc:Ignorable="w14 w15 w16se w16cid w16 w16cex w16sdtdh w16sdtfl w16du wp14">
+<w16cid:commentsIds xmlns:wpc="http://schemas.microsoft.com/office/word/2010/wordprocessingCanvas" xmlns:cx="http://schemas.microsoft.com/office/drawing/2014/chartex" xmlns:cx1="http://schemas.microsoft.com/office/drawing/2015/9/8/chartex" xmlns:cx2="http://schemas.microsoft.com/office/drawing/2015/10/21/chartex" xmlns:cx3="http://schemas.microsoft.com/office/drawing/2016/5/9/chartex" xmlns:cx4="http://schemas.microsoft.com/office/drawing/2016/5/10/chartex" xmlns:cx5="http://schemas.microsoft.com/office/drawing/2016/5/11/chartex" xmlns:cx6="http://schemas.microsoft.com/office/drawing/2016/5/12/chartex" xmlns:cx7="http://schemas.microsoft.com/office/drawing/2016/5/13/chartex" xmlns:cx8="http://schemas.microsoft.com/office/drawing/2016/5/14/chartex" xmlns:mc="http://schemas.openxmlformats.org/markup-compatibility/2006" xmlns:aink="http://schemas.microsoft.com/office/drawing/2016/ink" xmlns:am3d="http://schemas.microsoft.com/office/drawing/2017/model3d" xmlns:o="urn:schemas-microsoft-com:office:office" xmlns:oel="http://schemas.microsoft.com/office/2019/extlst" xmlns:r="http://schemas.openxmlformats.org/officeDocument/2006/relationships" xmlns:m="http://schemas.openxmlformats.org/officeDocument/2006/math" xmlns:v="urn:schemas-microsoft-com:vml" xmlns:wp14="http://schemas.microsoft.com/office/word/2010/wordprocessingDrawing" xmlns:wp="http://schemas.openxmlformats.org/drawingml/2006/wordprocessingDrawing" xmlns:w10="urn:schemas-microsoft-com:office:word" xmlns:w="http://schemas.openxmlformats.org/wordprocessingml/2006/main" xmlns:w14="http://schemas.microsoft.com/office/word/2010/wordml" xmlns:w15="http://schemas.microsoft.com/office/word/2012/wordml" xmlns:w16cei="http://schemas.microsoft.com/office/word/2026/wordml/cei" xmlns:w16cex="http://schemas.microsoft.com/office/word/2018/wordml/cex" xmlns:w16cid="http://schemas.microsoft.com/office/word/2016/wordml/cid" xmlns:w16="http://schemas.microsoft.com/office/word/2018/wordml" xmlns:w16du="http://schemas.microsoft.com/office/word/2023/wordml/word16du" xmlns:w16sdtdh="http://schemas.microsoft.com/office/word/2020/wordml/sdtdatahash" xmlns:w16sdtfl="http://schemas.microsoft.com/office/word/2024/wordml/sdtformatlock" xmlns:w16se="http://schemas.microsoft.com/office/word/2015/wordml/symex" xmlns:wpg="http://schemas.microsoft.com/office/word/2010/wordprocessingGroup" xmlns:wpi="http://schemas.microsoft.com/office/word/2010/wordprocessingInk" xmlns:wne="http://schemas.microsoft.com/office/word/2006/wordml" xmlns:wps="http://schemas.microsoft.com/office/word/2010/wordprocessingShape" mc:Ignorable="w14 w15 w16se w16cid w16 w16cex w16sdtdh w16sdtfl w16du wp14">
   <w16cid:commentId w16cid:paraId="729F0B3C" w16cid:durableId="669924E6"/>
   <w16cid:commentId w16cid:paraId="40C61E6C" w16cid:durableId="2BBC945F"/>
   <w16cid:commentId w16cid:paraId="30603793" w16cid:durableId="6BF40AD2"/>
@@ -10145,7 +10217,7 @@
 </file>
 
 <file path=word/endnotes.xml><?xml version="1.0" encoding="utf-8"?>
-<w:endnotes xmlns:wpc="http://schemas.microsoft.com/office/word/2010/wordprocessingCanvas" xmlns:cx="http://schemas.microsoft.com/office/drawing/2014/chartex" xmlns:cx1="http://schemas.microsoft.com/office/drawing/2015/9/8/chartex" xmlns:cx2="http://schemas.microsoft.com/office/drawing/2015/10/21/chartex" xmlns:cx3="http://schemas.microsoft.com/office/drawing/2016/5/9/chartex" xmlns:cx4="http://schemas.microsoft.com/office/drawing/2016/5/10/chartex" xmlns:cx5="http://schemas.microsoft.com/office/drawing/2016/5/11/chartex" xmlns:cx6="http://schemas.microsoft.com/office/drawing/2016/5/12/chartex" xmlns:cx7="http://schemas.microsoft.com/office/drawing/2016/5/13/chartex" xmlns:cx8="http://schemas.microsoft.com/office/drawing/2016/5/14/chartex" xmlns:mc="http://schemas.openxmlformats.org/markup-compatibility/2006" xmlns:aink="http://schemas.microsoft.com/office/drawing/2016/ink" xmlns:am3d="http://schemas.microsoft.com/office/drawing/2017/model3d" xmlns:o="urn:schemas-microsoft-com:office:office" xmlns:oel="http://schemas.microsoft.com/office/2019/extlst" xmlns:r="http://schemas.openxmlformats.org/officeDocument/2006/relationships" xmlns:m="http://schemas.openxmlformats.org/officeDocument/2006/math" xmlns:v="urn:schemas-microsoft-com:vml" xmlns:wp14="http://schemas.microsoft.com/office/word/2010/wordprocessingDrawing" xmlns:wp="http://schemas.openxmlformats.org/drawingml/2006/wordprocessingDrawing" xmlns:w10="urn:schemas-microsoft-com:office:word" xmlns:w="http://schemas.openxmlformats.org/wordprocessingml/2006/main" xmlns:w14="http://schemas.microsoft.com/office/word/2010/wordml" xmlns:w15="http://schemas.microsoft.com/office/word/2012/wordml" xmlns:w16cex="http://schemas.microsoft.com/office/word/2018/wordml/cex" xmlns:w16cid="http://schemas.microsoft.com/office/word/2016/wordml/cid" xmlns:w16="http://schemas.microsoft.com/office/word/2018/wordml" xmlns:w16du="http://schemas.microsoft.com/office/word/2023/wordml/word16du" xmlns:w16sdtdh="http://schemas.microsoft.com/office/word/2020/wordml/sdtdatahash" xmlns:w16sdtfl="http://schemas.microsoft.com/office/word/2024/wordml/sdtformatlock" xmlns:w16se="http://schemas.microsoft.com/office/word/2015/wordml/symex" xmlns:wpg="http://schemas.microsoft.com/office/word/2010/wordprocessingGroup" xmlns:wpi="http://schemas.microsoft.com/office/word/2010/wordprocessingInk" xmlns:wne="http://schemas.microsoft.com/office/word/2006/wordml" xmlns:wps="http://schemas.microsoft.com/office/word/2010/wordprocessingShape" mc:Ignorable="w14 w15 w16se w16cid w16 w16cex w16sdtdh w16sdtfl w16du wp14">
+<w:endnotes xmlns:wpc="http://schemas.microsoft.com/office/word/2010/wordprocessingCanvas" xmlns:cx="http://schemas.microsoft.com/office/drawing/2014/chartex" xmlns:cx1="http://schemas.microsoft.com/office/drawing/2015/9/8/chartex" xmlns:cx2="http://schemas.microsoft.com/office/drawing/2015/10/21/chartex" xmlns:cx3="http://schemas.microsoft.com/office/drawing/2016/5/9/chartex" xmlns:cx4="http://schemas.microsoft.com/office/drawing/2016/5/10/chartex" xmlns:cx5="http://schemas.microsoft.com/office/drawing/2016/5/11/chartex" xmlns:cx6="http://schemas.microsoft.com/office/drawing/2016/5/12/chartex" xmlns:cx7="http://schemas.microsoft.com/office/drawing/2016/5/13/chartex" xmlns:cx8="http://schemas.microsoft.com/office/drawing/2016/5/14/chartex" xmlns:mc="http://schemas.openxmlformats.org/markup-compatibility/2006" xmlns:aink="http://schemas.microsoft.com/office/drawing/2016/ink" xmlns:am3d="http://schemas.microsoft.com/office/drawing/2017/model3d" xmlns:o="urn:schemas-microsoft-com:office:office" xmlns:oel="http://schemas.microsoft.com/office/2019/extlst" xmlns:r="http://schemas.openxmlformats.org/officeDocument/2006/relationships" xmlns:m="http://schemas.openxmlformats.org/officeDocument/2006/math" xmlns:v="urn:schemas-microsoft-com:vml" xmlns:wp14="http://schemas.microsoft.com/office/word/2010/wordprocessingDrawing" xmlns:wp="http://schemas.openxmlformats.org/drawingml/2006/wordprocessingDrawing" xmlns:w10="urn:schemas-microsoft-com:office:word" xmlns:w="http://schemas.openxmlformats.org/wordprocessingml/2006/main" xmlns:w14="http://schemas.microsoft.com/office/word/2010/wordml" xmlns:w15="http://schemas.microsoft.com/office/word/2012/wordml" xmlns:w16cei="http://schemas.microsoft.com/office/word/2026/wordml/cei" xmlns:w16cex="http://schemas.microsoft.com/office/word/2018/wordml/cex" xmlns:w16cid="http://schemas.microsoft.com/office/word/2016/wordml/cid" xmlns:w16="http://schemas.microsoft.com/office/word/2018/wordml" xmlns:w16du="http://schemas.microsoft.com/office/word/2023/wordml/word16du" xmlns:w16sdtdh="http://schemas.microsoft.com/office/word/2020/wordml/sdtdatahash" xmlns:w16sdtfl="http://schemas.microsoft.com/office/word/2024/wordml/sdtformatlock" xmlns:w16se="http://schemas.microsoft.com/office/word/2015/wordml/symex" xmlns:wpg="http://schemas.microsoft.com/office/word/2010/wordprocessingGroup" xmlns:wpi="http://schemas.microsoft.com/office/word/2010/wordprocessingInk" xmlns:wne="http://schemas.microsoft.com/office/word/2006/wordml" xmlns:wps="http://schemas.microsoft.com/office/word/2010/wordprocessingShape" mc:Ignorable="w14 w15 w16se w16cid w16 w16cex w16sdtdh w16sdtfl w16du wp14">
   <w:endnote w:type="separator" w:id="-1">
     <w:p>
       <w:pPr>
@@ -10170,7 +10242,7 @@
 </file>
 
 <file path=word/footer1.xml><?xml version="1.0" encoding="utf-8"?>
-<w:ftr xmlns:wpc="http://schemas.microsoft.com/office/word/2010/wordprocessingCanvas" xmlns:cx="http://schemas.microsoft.com/office/drawing/2014/chartex" xmlns:cx1="http://schemas.microsoft.com/office/drawing/2015/9/8/chartex" xmlns:cx2="http://schemas.microsoft.com/office/drawing/2015/10/21/chartex" xmlns:cx3="http://schemas.microsoft.com/office/drawing/2016/5/9/chartex" xmlns:cx4="http://schemas.microsoft.com/office/drawing/2016/5/10/chartex" xmlns:cx5="http://schemas.microsoft.com/office/drawing/2016/5/11/chartex" xmlns:cx6="http://schemas.microsoft.com/office/drawing/2016/5/12/chartex" xmlns:cx7="http://schemas.microsoft.com/office/drawing/2016/5/13/chartex" xmlns:cx8="http://schemas.microsoft.com/office/drawing/2016/5/14/chartex" xmlns:mc="http://schemas.openxmlformats.org/markup-compatibility/2006" xmlns:aink="http://schemas.microsoft.com/office/drawing/2016/ink" xmlns:am3d="http://schemas.microsoft.com/office/drawing/2017/model3d" xmlns:o="urn:schemas-microsoft-com:office:office" xmlns:oel="http://schemas.microsoft.com/office/2019/extlst" xmlns:r="http://schemas.openxmlformats.org/officeDocument/2006/relationships" xmlns:m="http://schemas.openxmlformats.org/officeDocument/2006/math" xmlns:v="urn:schemas-microsoft-com:vml" xmlns:wp14="http://schemas.microsoft.com/office/word/2010/wordprocessingDrawing" xmlns:wp="http://schemas.openxmlformats.org/drawingml/2006/wordprocessingDrawing" xmlns:w10="urn:schemas-microsoft-com:office:word" xmlns:w="http://schemas.openxmlformats.org/wordprocessingml/2006/main" xmlns:w14="http://schemas.microsoft.com/office/word/2010/wordml" xmlns:w15="http://schemas.microsoft.com/office/word/2012/wordml" xmlns:w16cex="http://schemas.microsoft.com/office/word/2018/wordml/cex" xmlns:w16cid="http://schemas.microsoft.com/office/word/2016/wordml/cid" xmlns:w16="http://schemas.microsoft.com/office/word/2018/wordml" xmlns:w16du="http://schemas.microsoft.com/office/word/2023/wordml/word16du" xmlns:w16sdtdh="http://schemas.microsoft.com/office/word/2020/wordml/sdtdatahash" xmlns:w16sdtfl="http://schemas.microsoft.com/office/word/2024/wordml/sdtformatlock" xmlns:w16se="http://schemas.microsoft.com/office/word/2015/wordml/symex" xmlns:wpg="http://schemas.microsoft.com/office/word/2010/wordprocessingGroup" xmlns:wpi="http://schemas.microsoft.com/office/word/2010/wordprocessingInk" xmlns:wne="http://schemas.microsoft.com/office/word/2006/wordml" xmlns:wps="http://schemas.microsoft.com/office/word/2010/wordprocessingShape" mc:Ignorable="w14 w15 w16se w16cid w16 w16cex w16sdtdh w16sdtfl w16du wp14">
+<w:ftr xmlns:wpc="http://schemas.microsoft.com/office/word/2010/wordprocessingCanvas" xmlns:cx="http://schemas.microsoft.com/office/drawing/2014/chartex" xmlns:cx1="http://schemas.microsoft.com/office/drawing/2015/9/8/chartex" xmlns:cx2="http://schemas.microsoft.com/office/drawing/2015/10/21/chartex" xmlns:cx3="http://schemas.microsoft.com/office/drawing/2016/5/9/chartex" xmlns:cx4="http://schemas.microsoft.com/office/drawing/2016/5/10/chartex" xmlns:cx5="http://schemas.microsoft.com/office/drawing/2016/5/11/chartex" xmlns:cx6="http://schemas.microsoft.com/office/drawing/2016/5/12/chartex" xmlns:cx7="http://schemas.microsoft.com/office/drawing/2016/5/13/chartex" xmlns:cx8="http://schemas.microsoft.com/office/drawing/2016/5/14/chartex" xmlns:mc="http://schemas.openxmlformats.org/markup-compatibility/2006" xmlns:aink="http://schemas.microsoft.com/office/drawing/2016/ink" xmlns:am3d="http://schemas.microsoft.com/office/drawing/2017/model3d" xmlns:o="urn:schemas-microsoft-com:office:office" xmlns:oel="http://schemas.microsoft.com/office/2019/extlst" xmlns:r="http://schemas.openxmlformats.org/officeDocument/2006/relationships" xmlns:m="http://schemas.openxmlformats.org/officeDocument/2006/math" xmlns:v="urn:schemas-microsoft-com:vml" xmlns:wp14="http://schemas.microsoft.com/office/word/2010/wordprocessingDrawing" xmlns:wp="http://schemas.openxmlformats.org/drawingml/2006/wordprocessingDrawing" xmlns:w10="urn:schemas-microsoft-com:office:word" xmlns:w="http://schemas.openxmlformats.org/wordprocessingml/2006/main" xmlns:w14="http://schemas.microsoft.com/office/word/2010/wordml" xmlns:w15="http://schemas.microsoft.com/office/word/2012/wordml" xmlns:w16cei="http://schemas.microsoft.com/office/word/2026/wordml/cei" xmlns:w16cex="http://schemas.microsoft.com/office/word/2018/wordml/cex" xmlns:w16cid="http://schemas.microsoft.com/office/word/2016/wordml/cid" xmlns:w16="http://schemas.microsoft.com/office/word/2018/wordml" xmlns:w16du="http://schemas.microsoft.com/office/word/2023/wordml/word16du" xmlns:w16sdtdh="http://schemas.microsoft.com/office/word/2020/wordml/sdtdatahash" xmlns:w16sdtfl="http://schemas.microsoft.com/office/word/2024/wordml/sdtformatlock" xmlns:w16se="http://schemas.microsoft.com/office/word/2015/wordml/symex" xmlns:wpg="http://schemas.microsoft.com/office/word/2010/wordprocessingGroup" xmlns:wpi="http://schemas.microsoft.com/office/word/2010/wordprocessingInk" xmlns:wne="http://schemas.microsoft.com/office/word/2006/wordml" xmlns:wps="http://schemas.microsoft.com/office/word/2010/wordprocessingShape" mc:Ignorable="w14 w15 w16se w16cid w16 w16cex w16sdtdh w16sdtfl w16du wp14">
   <w:tbl>
     <w:tblPr>
       <w:tblW w:w="0" w:type="auto"/>
@@ -10223,7 +10295,7 @@
 </file>
 
 <file path=word/footnotes.xml><?xml version="1.0" encoding="utf-8"?>
-<w:footnotes xmlns:wpc="http://schemas.microsoft.com/office/word/2010/wordprocessingCanvas" xmlns:cx="http://schemas.microsoft.com/office/drawing/2014/chartex" xmlns:cx1="http://schemas.microsoft.com/office/drawing/2015/9/8/chartex" xmlns:cx2="http://schemas.microsoft.com/office/drawing/2015/10/21/chartex" xmlns:cx3="http://schemas.microsoft.com/office/drawing/2016/5/9/chartex" xmlns:cx4="http://schemas.microsoft.com/office/drawing/2016/5/10/chartex" xmlns:cx5="http://schemas.microsoft.com/office/drawing/2016/5/11/chartex" xmlns:cx6="http://schemas.microsoft.com/office/drawing/2016/5/12/chartex" xmlns:cx7="http://schemas.microsoft.com/office/drawing/2016/5/13/chartex" xmlns:cx8="http://schemas.microsoft.com/office/drawing/2016/5/14/chartex" xmlns:mc="http://schemas.openxmlformats.org/markup-compatibility/2006" xmlns:aink="http://schemas.microsoft.com/office/drawing/2016/ink" xmlns:am3d="http://schemas.microsoft.com/office/drawing/2017/model3d" xmlns:o="urn:schemas-microsoft-com:office:office" xmlns:oel="http://schemas.microsoft.com/office/2019/extlst" xmlns:r="http://schemas.openxmlformats.org/officeDocument/2006/relationships" xmlns:m="http://schemas.openxmlformats.org/officeDocument/2006/math" xmlns:v="urn:schemas-microsoft-com:vml" xmlns:wp14="http://schemas.microsoft.com/office/word/2010/wordprocessingDrawing" xmlns:wp="http://schemas.openxmlformats.org/drawingml/2006/wordprocessingDrawing" xmlns:w10="urn:schemas-microsoft-com:office:word" xmlns:w="http://schemas.openxmlformats.org/wordprocessingml/2006/main" xmlns:w14="http://schemas.microsoft.com/office/word/2010/wordml" xmlns:w15="http://schemas.microsoft.com/office/word/2012/wordml" xmlns:w16cex="http://schemas.microsoft.com/office/word/2018/wordml/cex" xmlns:w16cid="http://schemas.microsoft.com/office/word/2016/wordml/cid" xmlns:w16="http://schemas.microsoft.com/office/word/2018/wordml" xmlns:w16du="http://schemas.microsoft.com/office/word/2023/wordml/word16du" xmlns:w16sdtdh="http://schemas.microsoft.com/office/word/2020/wordml/sdtdatahash" xmlns:w16sdtfl="http://schemas.microsoft.com/office/word/2024/wordml/sdtformatlock" xmlns:w16se="http://schemas.microsoft.com/office/word/2015/wordml/symex" xmlns:wpg="http://schemas.microsoft.com/office/word/2010/wordprocessingGroup" xmlns:wpi="http://schemas.microsoft.com/office/word/2010/wordprocessingInk" xmlns:wne="http://schemas.microsoft.com/office/word/2006/wordml" xmlns:wps="http://schemas.microsoft.com/office/word/2010/wordprocessingShape" mc:Ignorable="w14 w15 w16se w16cid w16 w16cex w16sdtdh w16sdtfl w16du wp14">
+<w:footnotes xmlns:wpc="http://schemas.microsoft.com/office/word/2010/wordprocessingCanvas" xmlns:cx="http://schemas.microsoft.com/office/drawing/2014/chartex" xmlns:cx1="http://schemas.microsoft.com/office/drawing/2015/9/8/chartex" xmlns:cx2="http://schemas.microsoft.com/office/drawing/2015/10/21/chartex" xmlns:cx3="http://schemas.microsoft.com/office/drawing/2016/5/9/chartex" xmlns:cx4="http://schemas.microsoft.com/office/drawing/2016/5/10/chartex" xmlns:cx5="http://schemas.microsoft.com/office/drawing/2016/5/11/chartex" xmlns:cx6="http://schemas.microsoft.com/office/drawing/2016/5/12/chartex" xmlns:cx7="http://schemas.microsoft.com/office/drawing/2016/5/13/chartex" xmlns:cx8="http://schemas.microsoft.com/office/drawing/2016/5/14/chartex" xmlns:mc="http://schemas.openxmlformats.org/markup-compatibility/2006" xmlns:aink="http://schemas.microsoft.com/office/drawing/2016/ink" xmlns:am3d="http://schemas.microsoft.com/office/drawing/2017/model3d" xmlns:o="urn:schemas-microsoft-com:office:office" xmlns:oel="http://schemas.microsoft.com/office/2019/extlst" xmlns:r="http://schemas.openxmlformats.org/officeDocument/2006/relationships" xmlns:m="http://schemas.openxmlformats.org/officeDocument/2006/math" xmlns:v="urn:schemas-microsoft-com:vml" xmlns:wp14="http://schemas.microsoft.com/office/word/2010/wordprocessingDrawing" xmlns:wp="http://schemas.openxmlformats.org/drawingml/2006/wordprocessingDrawing" xmlns:w10="urn:schemas-microsoft-com:office:word" xmlns:w="http://schemas.openxmlformats.org/wordprocessingml/2006/main" xmlns:w14="http://schemas.microsoft.com/office/word/2010/wordml" xmlns:w15="http://schemas.microsoft.com/office/word/2012/wordml" xmlns:w16cei="http://schemas.microsoft.com/office/word/2026/wordml/cei" xmlns:w16cex="http://schemas.microsoft.com/office/word/2018/wordml/cex" xmlns:w16cid="http://schemas.microsoft.com/office/word/2016/wordml/cid" xmlns:w16="http://schemas.microsoft.com/office/word/2018/wordml" xmlns:w16du="http://schemas.microsoft.com/office/word/2023/wordml/word16du" xmlns:w16sdtdh="http://schemas.microsoft.com/office/word/2020/wordml/sdtdatahash" xmlns:w16sdtfl="http://schemas.microsoft.com/office/word/2024/wordml/sdtformatlock" xmlns:w16se="http://schemas.microsoft.com/office/word/2015/wordml/symex" xmlns:wpg="http://schemas.microsoft.com/office/word/2010/wordprocessingGroup" xmlns:wpi="http://schemas.microsoft.com/office/word/2010/wordprocessingInk" xmlns:wne="http://schemas.microsoft.com/office/word/2006/wordml" xmlns:wps="http://schemas.microsoft.com/office/word/2010/wordprocessingShape" mc:Ignorable="w14 w15 w16se w16cid w16 w16cex w16sdtdh w16sdtfl w16du wp14">
   <w:footnote w:type="separator" w:id="-1">
     <w:p>
       <w:pPr>
@@ -10248,7 +10320,7 @@
 </file>
 
 <file path=word/header1.xml><?xml version="1.0" encoding="utf-8"?>
-<w:hdr xmlns:wpc="http://schemas.microsoft.com/office/word/2010/wordprocessingCanvas" xmlns:cx="http://schemas.microsoft.com/office/drawing/2014/chartex" xmlns:cx1="http://schemas.microsoft.com/office/drawing/2015/9/8/chartex" xmlns:cx2="http://schemas.microsoft.com/office/drawing/2015/10/21/chartex" xmlns:cx3="http://schemas.microsoft.com/office/drawing/2016/5/9/chartex" xmlns:cx4="http://schemas.microsoft.com/office/drawing/2016/5/10/chartex" xmlns:cx5="http://schemas.microsoft.com/office/drawing/2016/5/11/chartex" xmlns:cx6="http://schemas.microsoft.com/office/drawing/2016/5/12/chartex" xmlns:cx7="http://schemas.microsoft.com/office/drawing/2016/5/13/chartex" xmlns:cx8="http://schemas.microsoft.com/office/drawing/2016/5/14/chartex" xmlns:mc="http://schemas.openxmlformats.org/markup-compatibility/2006" xmlns:aink="http://schemas.microsoft.com/office/drawing/2016/ink" xmlns:am3d="http://schemas.microsoft.com/office/drawing/2017/model3d" xmlns:o="urn:schemas-microsoft-com:office:office" xmlns:oel="http://schemas.microsoft.com/office/2019/extlst" xmlns:r="http://schemas.openxmlformats.org/officeDocument/2006/relationships" xmlns:m="http://schemas.openxmlformats.org/officeDocument/2006/math" xmlns:v="urn:schemas-microsoft-com:vml" xmlns:wp14="http://schemas.microsoft.com/office/word/2010/wordprocessingDrawing" xmlns:wp="http://schemas.openxmlformats.org/drawingml/2006/wordprocessingDrawing" xmlns:w10="urn:schemas-microsoft-com:office:word" xmlns:w="http://schemas.openxmlformats.org/wordprocessingml/2006/main" xmlns:w14="http://schemas.microsoft.com/office/word/2010/wordml" xmlns:w15="http://schemas.microsoft.com/office/word/2012/wordml" xmlns:w16cex="http://schemas.microsoft.com/office/word/2018/wordml/cex" xmlns:w16cid="http://schemas.microsoft.com/office/word/2016/wordml/cid" xmlns:w16="http://schemas.microsoft.com/office/word/2018/wordml" xmlns:w16du="http://schemas.microsoft.com/office/word/2023/wordml/word16du" xmlns:w16sdtdh="http://schemas.microsoft.com/office/word/2020/wordml/sdtdatahash" xmlns:w16sdtfl="http://schemas.microsoft.com/office/word/2024/wordml/sdtformatlock" xmlns:w16se="http://schemas.microsoft.com/office/word/2015/wordml/symex" xmlns:wpg="http://schemas.microsoft.com/office/word/2010/wordprocessingGroup" xmlns:wpi="http://schemas.microsoft.com/office/word/2010/wordprocessingInk" xmlns:wne="http://schemas.microsoft.com/office/word/2006/wordml" xmlns:wps="http://schemas.microsoft.com/office/word/2010/wordprocessingShape" mc:Ignorable="w14 w15 w16se w16cid w16 w16cex w16sdtdh w16sdtfl w16du wp14">
+<w:hdr xmlns:wpc="http://schemas.microsoft.com/office/word/2010/wordprocessingCanvas" xmlns:cx="http://schemas.microsoft.com/office/drawing/2014/chartex" xmlns:cx1="http://schemas.microsoft.com/office/drawing/2015/9/8/chartex" xmlns:cx2="http://schemas.microsoft.com/office/drawing/2015/10/21/chartex" xmlns:cx3="http://schemas.microsoft.com/office/drawing/2016/5/9/chartex" xmlns:cx4="http://schemas.microsoft.com/office/drawing/2016/5/10/chartex" xmlns:cx5="http://schemas.microsoft.com/office/drawing/2016/5/11/chartex" xmlns:cx6="http://schemas.microsoft.com/office/drawing/2016/5/12/chartex" xmlns:cx7="http://schemas.microsoft.com/office/drawing/2016/5/13/chartex" xmlns:cx8="http://schemas.microsoft.com/office/drawing/2016/5/14/chartex" xmlns:mc="http://schemas.openxmlformats.org/markup-compatibility/2006" xmlns:aink="http://schemas.microsoft.com/office/drawing/2016/ink" xmlns:am3d="http://schemas.microsoft.com/office/drawing/2017/model3d" xmlns:o="urn:schemas-microsoft-com:office:office" xmlns:oel="http://schemas.microsoft.com/office/2019/extlst" xmlns:r="http://schemas.openxmlformats.org/officeDocument/2006/relationships" xmlns:m="http://schemas.openxmlformats.org/officeDocument/2006/math" xmlns:v="urn:schemas-microsoft-com:vml" xmlns:wp14="http://schemas.microsoft.com/office/word/2010/wordprocessingDrawing" xmlns:wp="http://schemas.openxmlformats.org/drawingml/2006/wordprocessingDrawing" xmlns:w10="urn:schemas-microsoft-com:office:word" xmlns:w="http://schemas.openxmlformats.org/wordprocessingml/2006/main" xmlns:w14="http://schemas.microsoft.com/office/word/2010/wordml" xmlns:w15="http://schemas.microsoft.com/office/word/2012/wordml" xmlns:w16cei="http://schemas.microsoft.com/office/word/2026/wordml/cei" xmlns:w16cex="http://schemas.microsoft.com/office/word/2018/wordml/cex" xmlns:w16cid="http://schemas.microsoft.com/office/word/2016/wordml/cid" xmlns:w16="http://schemas.microsoft.com/office/word/2018/wordml" xmlns:w16du="http://schemas.microsoft.com/office/word/2023/wordml/word16du" xmlns:w16sdtdh="http://schemas.microsoft.com/office/word/2020/wordml/sdtdatahash" xmlns:w16sdtfl="http://schemas.microsoft.com/office/word/2024/wordml/sdtformatlock" xmlns:w16se="http://schemas.microsoft.com/office/word/2015/wordml/symex" xmlns:wpg="http://schemas.microsoft.com/office/word/2010/wordprocessingGroup" xmlns:wpi="http://schemas.microsoft.com/office/word/2010/wordprocessingInk" xmlns:wne="http://schemas.microsoft.com/office/word/2006/wordml" xmlns:wps="http://schemas.microsoft.com/office/word/2010/wordprocessingShape" mc:Ignorable="w14 w15 w16se w16cid w16 w16cex w16sdtdh w16sdtfl w16du wp14">
   <w:tbl>
     <w:tblPr>
       <w:tblW w:w="0" w:type="auto"/>
@@ -10301,7 +10373,7 @@
 </file>
 
 <file path=word/numbering.xml><?xml version="1.0" encoding="utf-8"?>
-<w:numbering xmlns:wpc="http://schemas.microsoft.com/office/word/2010/wordprocessingCanvas" xmlns:cx="http://schemas.microsoft.com/office/drawing/2014/chartex" xmlns:cx1="http://schemas.microsoft.com/office/drawing/2015/9/8/chartex" xmlns:cx2="http://schemas.microsoft.com/office/drawing/2015/10/21/chartex" xmlns:cx3="http://schemas.microsoft.com/office/drawing/2016/5/9/chartex" xmlns:cx4="http://schemas.microsoft.com/office/drawing/2016/5/10/chartex" xmlns:cx5="http://schemas.microsoft.com/office/drawing/2016/5/11/chartex" xmlns:cx6="http://schemas.microsoft.com/office/drawing/2016/5/12/chartex" xmlns:cx7="http://schemas.microsoft.com/office/drawing/2016/5/13/chartex" xmlns:cx8="http://schemas.microsoft.com/office/drawing/2016/5/14/chartex" xmlns:mc="http://schemas.openxmlformats.org/markup-compatibility/2006" xmlns:aink="http://schemas.microsoft.com/office/drawing/2016/ink" xmlns:am3d="http://schemas.microsoft.com/office/drawing/2017/model3d" xmlns:o="urn:schemas-microsoft-com:office:office" xmlns:oel="http://schemas.microsoft.com/office/2019/extlst" xmlns:r="http://schemas.openxmlformats.org/officeDocument/2006/relationships" xmlns:m="http://schemas.openxmlformats.org/officeDocument/2006/math" xmlns:v="urn:schemas-microsoft-com:vml" xmlns:wp14="http://schemas.microsoft.com/office/word/2010/wordprocessingDrawing" xmlns:wp="http://schemas.openxmlformats.org/drawingml/2006/wordprocessingDrawing" xmlns:w10="urn:schemas-microsoft-com:office:word" xmlns:w="http://schemas.openxmlformats.org/wordprocessingml/2006/main" xmlns:w14="http://schemas.microsoft.com/office/word/2010/wordml" xmlns:w15="http://schemas.microsoft.com/office/word/2012/wordml" xmlns:w16cex="http://schemas.microsoft.com/office/word/2018/wordml/cex" xmlns:w16cid="http://schemas.microsoft.com/office/word/2016/wordml/cid" xmlns:w16="http://schemas.microsoft.com/office/word/2018/wordml" xmlns:w16du="http://schemas.microsoft.com/office/word/2023/wordml/word16du" xmlns:w16sdtdh="http://schemas.microsoft.com/office/word/2020/wordml/sdtdatahash" xmlns:w16sdtfl="http://schemas.microsoft.com/office/word/2024/wordml/sdtformatlock" xmlns:w16se="http://schemas.microsoft.com/office/word/2015/wordml/symex" xmlns:wpg="http://schemas.microsoft.com/office/word/2010/wordprocessingGroup" xmlns:wpi="http://schemas.microsoft.com/office/word/2010/wordprocessingInk" xmlns:wne="http://schemas.microsoft.com/office/word/2006/wordml" xmlns:wps="http://schemas.microsoft.com/office/word/2010/wordprocessingShape" mc:Ignorable="w14 w15 w16se w16cid w16 w16cex w16sdtdh w16sdtfl w16du wp14">
+<w:numbering xmlns:wpc="http://schemas.microsoft.com/office/word/2010/wordprocessingCanvas" xmlns:cx="http://schemas.microsoft.com/office/drawing/2014/chartex" xmlns:cx1="http://schemas.microsoft.com/office/drawing/2015/9/8/chartex" xmlns:cx2="http://schemas.microsoft.com/office/drawing/2015/10/21/chartex" xmlns:cx3="http://schemas.microsoft.com/office/drawing/2016/5/9/chartex" xmlns:cx4="http://schemas.microsoft.com/office/drawing/2016/5/10/chartex" xmlns:cx5="http://schemas.microsoft.com/office/drawing/2016/5/11/chartex" xmlns:cx6="http://schemas.microsoft.com/office/drawing/2016/5/12/chartex" xmlns:cx7="http://schemas.microsoft.com/office/drawing/2016/5/13/chartex" xmlns:cx8="http://schemas.microsoft.com/office/drawing/2016/5/14/chartex" xmlns:mc="http://schemas.openxmlformats.org/markup-compatibility/2006" xmlns:aink="http://schemas.microsoft.com/office/drawing/2016/ink" xmlns:am3d="http://schemas.microsoft.com/office/drawing/2017/model3d" xmlns:o="urn:schemas-microsoft-com:office:office" xmlns:oel="http://schemas.microsoft.com/office/2019/extlst" xmlns:r="http://schemas.openxmlformats.org/officeDocument/2006/relationships" xmlns:m="http://schemas.openxmlformats.org/officeDocument/2006/math" xmlns:v="urn:schemas-microsoft-com:vml" xmlns:wp14="http://schemas.microsoft.com/office/word/2010/wordprocessingDrawing" xmlns:wp="http://schemas.openxmlformats.org/drawingml/2006/wordprocessingDrawing" xmlns:w10="urn:schemas-microsoft-com:office:word" xmlns:w="http://schemas.openxmlformats.org/wordprocessingml/2006/main" xmlns:w14="http://schemas.microsoft.com/office/word/2010/wordml" xmlns:w15="http://schemas.microsoft.com/office/word/2012/wordml" xmlns:w16cei="http://schemas.microsoft.com/office/word/2026/wordml/cei" xmlns:w16cex="http://schemas.microsoft.com/office/word/2018/wordml/cex" xmlns:w16cid="http://schemas.microsoft.com/office/word/2016/wordml/cid" xmlns:w16="http://schemas.microsoft.com/office/word/2018/wordml" xmlns:w16du="http://schemas.microsoft.com/office/word/2023/wordml/word16du" xmlns:w16sdtdh="http://schemas.microsoft.com/office/word/2020/wordml/sdtdatahash" xmlns:w16sdtfl="http://schemas.microsoft.com/office/word/2024/wordml/sdtformatlock" xmlns:w16se="http://schemas.microsoft.com/office/word/2015/wordml/symex" xmlns:wpg="http://schemas.microsoft.com/office/word/2010/wordprocessingGroup" xmlns:wpi="http://schemas.microsoft.com/office/word/2010/wordprocessingInk" xmlns:wne="http://schemas.microsoft.com/office/word/2006/wordml" xmlns:wps="http://schemas.microsoft.com/office/word/2010/wordprocessingShape" mc:Ignorable="w14 w15 w16se w16cid w16 w16cex w16sdtdh w16sdtfl w16du wp14">
   <w:abstractNum w:abstractNumId="0" w15:restartNumberingAfterBreak="0">
     <w:nsid w:val="00D34411"/>
     <w:multiLevelType w:val="multilevel"/>
@@ -15124,7 +15196,7 @@
 </file>
 
 <file path=word/people.xml><?xml version="1.0" encoding="utf-8"?>
-<w15:people xmlns:wpc="http://schemas.microsoft.com/office/word/2010/wordprocessingCanvas" xmlns:cx="http://schemas.microsoft.com/office/drawing/2014/chartex" xmlns:cx1="http://schemas.microsoft.com/office/drawing/2015/9/8/chartex" xmlns:cx2="http://schemas.microsoft.com/office/drawing/2015/10/21/chartex" xmlns:cx3="http://schemas.microsoft.com/office/drawing/2016/5/9/chartex" xmlns:cx4="http://schemas.microsoft.com/office/drawing/2016/5/10/chartex" xmlns:cx5="http://schemas.microsoft.com/office/drawing/2016/5/11/chartex" xmlns:cx6="http://schemas.microsoft.com/office/drawing/2016/5/12/chartex" xmlns:cx7="http://schemas.microsoft.com/office/drawing/2016/5/13/chartex" xmlns:cx8="http://schemas.microsoft.com/office/drawing/2016/5/14/chartex" xmlns:mc="http://schemas.openxmlformats.org/markup-compatibility/2006" xmlns:aink="http://schemas.microsoft.com/office/drawing/2016/ink" xmlns:am3d="http://schemas.microsoft.com/office/drawing/2017/model3d" xmlns:o="urn:schemas-microsoft-com:office:office" xmlns:oel="http://schemas.microsoft.com/office/2019/extlst" xmlns:r="http://schemas.openxmlformats.org/officeDocument/2006/relationships" xmlns:m="http://schemas.openxmlformats.org/officeDocument/2006/math" xmlns:v="urn:schemas-microsoft-com:vml" xmlns:wp14="http://schemas.microsoft.com/office/word/2010/wordprocessingDrawing" xmlns:wp="http://schemas.openxmlformats.org/drawingml/2006/wordprocessingDrawing" xmlns:w10="urn:schemas-microsoft-com:office:word" xmlns:w="http://schemas.openxmlformats.org/wordprocessingml/2006/main" xmlns:w14="http://schemas.microsoft.com/office/word/2010/wordml" xmlns:w15="http://schemas.microsoft.com/office/word/2012/wordml" xmlns:w16cex="http://schemas.microsoft.com/office/word/2018/wordml/cex" xmlns:w16cid="http://schemas.microsoft.com/office/word/2016/wordml/cid" xmlns:w16="http://schemas.microsoft.com/office/word/2018/wordml" xmlns:w16du="http://schemas.microsoft.com/office/word/2023/wordml/word16du" xmlns:w16sdtdh="http://schemas.microsoft.com/office/word/2020/wordml/sdtdatahash" xmlns:w16sdtfl="http://schemas.microsoft.com/office/word/2024/wordml/sdtformatlock" xmlns:w16se="http://schemas.microsoft.com/office/word/2015/wordml/symex" xmlns:wpg="http://schemas.microsoft.com/office/word/2010/wordprocessingGroup" xmlns:wpi="http://schemas.microsoft.com/office/word/2010/wordprocessingInk" xmlns:wne="http://schemas.microsoft.com/office/word/2006/wordml" xmlns:wps="http://schemas.microsoft.com/office/word/2010/wordprocessingShape" mc:Ignorable="w14 w15 w16se w16cid w16 w16cex w16sdtdh w16sdtfl w16du wp14">
+<w15:people xmlns:wpc="http://schemas.microsoft.com/office/word/2010/wordprocessingCanvas" xmlns:cx="http://schemas.microsoft.com/office/drawing/2014/chartex" xmlns:cx1="http://schemas.microsoft.com/office/drawing/2015/9/8/chartex" xmlns:cx2="http://schemas.microsoft.com/office/drawing/2015/10/21/chartex" xmlns:cx3="http://schemas.microsoft.com/office/drawing/2016/5/9/chartex" xmlns:cx4="http://schemas.microsoft.com/office/drawing/2016/5/10/chartex" xmlns:cx5="http://schemas.microsoft.com/office/drawing/2016/5/11/chartex" xmlns:cx6="http://schemas.microsoft.com/office/drawing/2016/5/12/chartex" xmlns:cx7="http://schemas.microsoft.com/office/drawing/2016/5/13/chartex" xmlns:cx8="http://schemas.microsoft.com/office/drawing/2016/5/14/chartex" xmlns:mc="http://schemas.openxmlformats.org/markup-compatibility/2006" xmlns:aink="http://schemas.microsoft.com/office/drawing/2016/ink" xmlns:am3d="http://schemas.microsoft.com/office/drawing/2017/model3d" xmlns:o="urn:schemas-microsoft-com:office:office" xmlns:oel="http://schemas.microsoft.com/office/2019/extlst" xmlns:r="http://schemas.openxmlformats.org/officeDocument/2006/relationships" xmlns:m="http://schemas.openxmlformats.org/officeDocument/2006/math" xmlns:v="urn:schemas-microsoft-com:vml" xmlns:wp14="http://schemas.microsoft.com/office/word/2010/wordprocessingDrawing" xmlns:wp="http://schemas.openxmlformats.org/drawingml/2006/wordprocessingDrawing" xmlns:w10="urn:schemas-microsoft-com:office:word" xmlns:w="http://schemas.openxmlformats.org/wordprocessingml/2006/main" xmlns:w14="http://schemas.microsoft.com/office/word/2010/wordml" xmlns:w15="http://schemas.microsoft.com/office/word/2012/wordml" xmlns:w16cei="http://schemas.microsoft.com/office/word/2026/wordml/cei" xmlns:w16cex="http://schemas.microsoft.com/office/word/2018/wordml/cex" xmlns:w16cid="http://schemas.microsoft.com/office/word/2016/wordml/cid" xmlns:w16="http://schemas.microsoft.com/office/word/2018/wordml" xmlns:w16du="http://schemas.microsoft.com/office/word/2023/wordml/word16du" xmlns:w16sdtdh="http://schemas.microsoft.com/office/word/2020/wordml/sdtdatahash" xmlns:w16sdtfl="http://schemas.microsoft.com/office/word/2024/wordml/sdtformatlock" xmlns:w16se="http://schemas.microsoft.com/office/word/2015/wordml/symex" xmlns:wpg="http://schemas.microsoft.com/office/word/2010/wordprocessingGroup" xmlns:wpi="http://schemas.microsoft.com/office/word/2010/wordprocessingInk" xmlns:wne="http://schemas.microsoft.com/office/word/2006/wordml" xmlns:wps="http://schemas.microsoft.com/office/word/2010/wordprocessingShape" mc:Ignorable="w14 w15 w16se w16cid w16 w16cex w16sdtdh w16sdtfl w16du wp14">
   <w15:person w15:author="Kristin Burmeister">
     <w15:presenceInfo w15:providerId="AD" w15:userId="S::SA07KB@sams.ac.uk::36ee710c-25aa-4549-8dac-543caa2d2369"/>
   </w15:person>

</xml_diff>